<commit_message>
Style guide: require US English; add the check to md2docx.py
The guide covered voice, em-dashes, prohibited words and positioning but
never stated a spelling convention, so there was no rule to check against.
Section 05 now has a Mechanics subsection: US English throughout, with a
table of the forms that slip in most often, plus the em-dash rule restated
where the other mechanics live rather than only in the document header.

scripts/md2docx.py now checks the source .md for both on every regeneration,
and takes --check-only to run the check alone. It warns and never blocks,
because quoted source material can legitimately trip it. Passages that
should be exempt, such as a study title published with British spelling,
are wrapped in style-check ignore/resume comments; the guide's own table
of forbidden forms uses that marker.

Co-Authored-By: Claude Opus 5 <noreply@anthropic.com>
</commit_message>
<xml_diff>
--- a/campaigns/README.docx
+++ b/campaigns/README.docx
@@ -475,7 +475,37 @@
         <w:pStyle w:val="FirstParagraph"/>
       </w:pPr>
       <w:r>
-        <w:t xml:space="preserve">That runs pandoc and then injects table gridlines, which Standing Rule 1b requires on every cell and pandoc does not add. It accepts several files at once, and works on the root-level docs too. Use it rather than calling pandoc directly, or the gridlines get missed. Forgetting to regenerate at all is the more common failure: the</w:t>
+        <w:t xml:space="preserve">That runs pandoc and then injects table gridlines, which Standing Rule 1b requires on every cell and pandoc does not add. It accepts several files at once, and works on the root-level docs too. It also checks the source</w:t>
+      </w:r>
+      <w:r>
+        <w:t xml:space="preserve"> </w:t>
+      </w:r>
+      <w:r>
+        <w:rPr>
+          <w:rStyle w:val="VerbatimChar"/>
+        </w:rPr>
+        <w:t xml:space="preserve">.md</w:t>
+      </w:r>
+      <w:r>
+        <w:t xml:space="preserve"> </w:t>
+      </w:r>
+      <w:r>
+        <w:t xml:space="preserve">for British spellings and em-dashes and prints warnings without blocking;</w:t>
+      </w:r>
+      <w:r>
+        <w:t xml:space="preserve"> </w:t>
+      </w:r>
+      <w:r>
+        <w:rPr>
+          <w:rStyle w:val="VerbatimChar"/>
+        </w:rPr>
+        <w:t xml:space="preserve">--check-only</w:t>
+      </w:r>
+      <w:r>
+        <w:t xml:space="preserve"> </w:t>
+      </w:r>
+      <w:r>
+        <w:t xml:space="preserve">runs that check on its own. Use it rather than calling pandoc directly, or the gridlines get missed. Forgetting to regenerate at all is the more common failure: the</w:t>
       </w:r>
       <w:r>
         <w:t xml:space="preserve"> </w:t>

</xml_diff>

<commit_message>
Add a pre-commit style gate for Enyrgy brand documents
The checker only warned, and a warning printed during .docx regeneration
is easy to miss, which is how nineteen findings accumulated unnoticed.

.githooks/pre-commit runs it against staged Enyrgy_*.md and campaigns/*.md
and blocks on a finding. Scope is deliberately narrow: Paperclip product
docs under doc/, packages/ and skills/ are outside the brand style guide
and carry many em-dashes of their own, so gating them would block
unrelated engineering work.

Hooks live in a tracked .githooks/ rather than .git/hooks so they survive
a clone. Each clone enables them once with
  git config core.hooksPath .githooks

md2docx.py gains --strict, which exits non-zero on findings. Without it
the behavior is unchanged: warn, never block.

Escapes are the style-check ignore/resume comments for quoted material,
and git commit --no-verify.

Co-Authored-By: Claude Opus 5 <noreply@anthropic.com>
</commit_message>
<xml_diff>
--- a/campaigns/README.docx
+++ b/campaigns/README.docx
@@ -505,7 +505,103 @@
         <w:t xml:space="preserve"> </w:t>
       </w:r>
       <w:r>
-        <w:t xml:space="preserve">runs that check on its own. Use it rather than calling pandoc directly, or the gridlines get missed. Forgetting to regenerate at all is the more common failure: the</w:t>
+        <w:t xml:space="preserve">runs that check on its own.</w:t>
+      </w:r>
+    </w:p>
+    <w:p>
+      <w:pPr>
+        <w:pStyle w:val="BodyText"/>
+      </w:pPr>
+      <w:r>
+        <w:t xml:space="preserve">A pre-commit hook runs the same check against staged</w:t>
+      </w:r>
+      <w:r>
+        <w:t xml:space="preserve"> </w:t>
+      </w:r>
+      <w:r>
+        <w:rPr>
+          <w:rStyle w:val="VerbatimChar"/>
+        </w:rPr>
+        <w:t xml:space="preserve">Enyrgy_*.md</w:t>
+      </w:r>
+      <w:r>
+        <w:t xml:space="preserve"> </w:t>
+      </w:r>
+      <w:r>
+        <w:t xml:space="preserve">and</w:t>
+      </w:r>
+      <w:r>
+        <w:t xml:space="preserve"> </w:t>
+      </w:r>
+      <w:r>
+        <w:rPr>
+          <w:rStyle w:val="VerbatimChar"/>
+        </w:rPr>
+        <w:t xml:space="preserve">campaigns/*.md</w:t>
+      </w:r>
+      <w:r>
+        <w:t xml:space="preserve"> </w:t>
+      </w:r>
+      <w:r>
+        <w:t xml:space="preserve">and blocks the commit on a finding. Enable it once per clone:</w:t>
+      </w:r>
+    </w:p>
+    <w:p>
+      <w:pPr>
+        <w:pStyle w:val="SourceCode"/>
+      </w:pPr>
+      <w:r>
+        <w:rPr>
+          <w:rStyle w:val="VerbatimChar"/>
+        </w:rPr>
+        <w:t xml:space="preserve">git config core.hooksPath .githooks</w:t>
+      </w:r>
+    </w:p>
+    <w:p>
+      <w:pPr>
+        <w:pStyle w:val="FirstParagraph"/>
+      </w:pPr>
+      <w:r>
+        <w:t xml:space="preserve">Wrap a legitimate quotation in</w:t>
+      </w:r>
+      <w:r>
+        <w:t xml:space="preserve"> </w:t>
+      </w:r>
+      <w:r>
+        <w:rPr>
+          <w:rStyle w:val="VerbatimChar"/>
+        </w:rPr>
+        <w:t xml:space="preserve">&lt;!-- style-check: ignore --&gt;</w:t>
+      </w:r>
+      <w:r>
+        <w:t xml:space="preserve"> </w:t>
+      </w:r>
+      <w:r>
+        <w:t xml:space="preserve">/</w:t>
+      </w:r>
+      <w:r>
+        <w:t xml:space="preserve"> </w:t>
+      </w:r>
+      <w:r>
+        <w:rPr>
+          <w:rStyle w:val="VerbatimChar"/>
+        </w:rPr>
+        <w:t xml:space="preserve">&lt;!-- style-check: resume --&gt;</w:t>
+      </w:r>
+      <w:r>
+        <w:t xml:space="preserve">, or bypass once with</w:t>
+      </w:r>
+      <w:r>
+        <w:t xml:space="preserve"> </w:t>
+      </w:r>
+      <w:r>
+        <w:rPr>
+          <w:rStyle w:val="VerbatimChar"/>
+        </w:rPr>
+        <w:t xml:space="preserve">git commit --no-verify</w:t>
+      </w:r>
+      <w:r>
+        <w:t xml:space="preserve">. Use it rather than calling pandoc directly, or the gridlines get missed. Forgetting to regenerate at all is the more common failure: the</w:t>
       </w:r>
       <w:r>
         <w:t xml:space="preserve"> </w:t>

</xml_diff>